<commit_message>
Switch to metadata-only classification and filename-based headings (no previews)
</commit_message>
<xml_diff>
--- a/documents/Secutity Spec.docx
+++ b/documents/Secutity Spec.docx
@@ -3204,6 +3204,29 @@
         </w:rPr>
         <w:t>10. Security Testing Requirements</w:t>
       </w:r>
+      <w:r>
+        <w:rPr>
+          <w:b/>
+          <w:bCs/>
+        </w:rPr>
+        <w:t xml:space="preserve"> - </w:t>
+      </w:r>
+      <w:r>
+        <w:rPr>
+          <w:b/>
+          <w:bCs/>
+        </w:rPr>
+        <w:t xml:space="preserve">Covered by STRIDE + </w:t>
+      </w:r>
+      <w:proofErr w:type="spellStart"/>
+      <w:r>
+        <w:rPr>
+          <w:b/>
+          <w:bCs/>
+        </w:rPr>
+        <w:t>Semgrep</w:t>
+      </w:r>
+      <w:proofErr w:type="spellEnd"/>
     </w:p>
     <w:p>
       <w:pPr>

</xml_diff>